<commit_message>
Fix reservation document downloads and layout
</commit_message>
<xml_diff>
--- a/frontend/public/documents/document-2.docx
+++ b/frontend/public/documents/document-2.docx
@@ -5623,16 +5623,6 @@
         <w:rPr>
           <w:sz w:val="16"/>
         </w:rPr>
-        <w:sectPr>
-          <w:headerReference w:type="default" r:id="rId8"/>
-          <w:footerReference w:type="default" r:id="rId9"/>
-          <w:type w:val="continuous"/>
-          <w:pgSz w:w="11906" w:h="16838" w:code="9"/>
-          <w:pgMar w:top="2000" w:right="600" w:bottom="360" w:left="460" w:header="355" w:footer="170" w:gutter="0"/>
-          <w:pgNumType w:start="1"/>
-          <w:cols w:space="720"/>
-          <w:docGrid w:linePitch="299"/>
-        </w:sectPr>
       </w:pPr>
       <w:r>
         <w:rPr>
@@ -5687,15 +5677,6 @@
         </w:rPr>
         <w:t>e</w:t>
       </w:r>
-    </w:p>
-    <w:p>
-      <w:pPr>
-        <w:pStyle w:val="BodyText"/>
-        <w:spacing w:before="4"/>
-        <w:rPr>
-          <w:sz w:val="17"/>
-        </w:rPr>
-      </w:pPr>
     </w:p>
     <w:sectPr>
       <w:pgSz w:w="11906" w:h="16838" w:code="9"/>

</xml_diff>